<commit_message>
include link to kaggle dataset
</commit_message>
<xml_diff>
--- a/Petrol.docx
+++ b/Petrol.docx
@@ -2,6 +2,25 @@
 <file path=word/document.xml><?xml version="1.0" encoding="utf-8"?>
 <w:document xmlns:wpc="http://schemas.microsoft.com/office/word/2010/wordprocessingCanvas" xmlns:cx="http://schemas.microsoft.com/office/drawing/2014/chartex" xmlns:cx1="http://schemas.microsoft.com/office/drawing/2015/9/8/chartex" xmlns:cx2="http://schemas.microsoft.com/office/drawing/2015/10/21/chartex" xmlns:cx3="http://schemas.microsoft.com/office/drawing/2016/5/9/chartex" xmlns:cx4="http://schemas.microsoft.com/office/drawing/2016/5/10/chartex" xmlns:cx5="http://schemas.microsoft.com/office/drawing/2016/5/11/chartex" xmlns:cx6="http://schemas.microsoft.com/office/drawing/2016/5/12/chartex" xmlns:cx7="http://schemas.microsoft.com/office/drawing/2016/5/13/chartex" xmlns:cx8="http://schemas.microsoft.com/office/drawing/2016/5/14/chartex" xmlns:mc="http://schemas.openxmlformats.org/markup-compatibility/2006" xmlns:aink="http://schemas.microsoft.com/office/drawing/2016/ink" xmlns:am3d="http://schemas.microsoft.com/office/drawing/2017/model3d" xmlns:o="urn:schemas-microsoft-com:office:office" xmlns:oel="http://schemas.microsoft.com/office/2019/extlst" xmlns:r="http://schemas.openxmlformats.org/officeDocument/2006/relationships" xmlns:m="http://schemas.openxmlformats.org/officeDocument/2006/math" xmlns:v="urn:schemas-microsoft-com:vml" xmlns:wp14="http://schemas.microsoft.com/office/word/2010/wordprocessingDrawing" xmlns:wp="http://schemas.openxmlformats.org/drawingml/2006/wordprocessingDrawing" xmlns:w10="urn:schemas-microsoft-com:office:word" xmlns:w="http://schemas.openxmlformats.org/wordprocessingml/2006/main" xmlns:w14="http://schemas.microsoft.com/office/word/2010/wordml" xmlns:w15="http://schemas.microsoft.com/office/word/2012/wordml" xmlns:w16cex="http://schemas.microsoft.com/office/word/2018/wordml/cex" xmlns:w16cid="http://schemas.microsoft.com/office/word/2016/wordml/cid" xmlns:w16="http://schemas.microsoft.com/office/word/2018/wordml" xmlns:w16sdtdh="http://schemas.microsoft.com/office/word/2020/wordml/sdtdatahash" xmlns:w16se="http://schemas.microsoft.com/office/word/2015/wordml/symex" xmlns:wpg="http://schemas.microsoft.com/office/word/2010/wordprocessingGroup" xmlns:wpi="http://schemas.microsoft.com/office/word/2010/wordprocessingInk" xmlns:wne="http://schemas.microsoft.com/office/word/2006/wordml" xmlns:wps="http://schemas.microsoft.com/office/word/2010/wordprocessingShape" mc:Ignorable="w14 w15 w16se w16cid w16 w16cex w16sdtdh wp14">
   <w:body>
+    <w:p>
+      <w:pPr>
+        <w:pStyle w:val="Heading1"/>
+      </w:pPr>
+      <w:r>
+        <w:t>Dataset:</w:t>
+      </w:r>
+    </w:p>
+    <w:p>
+      <w:hyperlink r:id="rId5" w:history="1">
+        <w:r>
+          <w:rPr>
+            <w:rStyle w:val="Hyperlink"/>
+          </w:rPr>
+          <w:t>https://www.kaggle.com/datasets/jamesb7/fuel-prices-uk/data</w:t>
+        </w:r>
+      </w:hyperlink>
+    </w:p>
+    <w:p/>
     <w:p>
       <w:pPr>
         <w:pStyle w:val="Heading1"/>
@@ -286,18 +305,6 @@
         </w:rPr>
         <w:t> called </w:t>
       </w:r>
-      <w:r>
-        <w:rPr>
-          <w:rFonts w:ascii="Courier New" w:eastAsia="Times New Roman" w:hAnsi="Courier New" w:cs="Courier New"/>
-          <w:color w:val="000000"/>
-          <w:kern w:val="0"/>
-          <w:sz w:val="20"/>
-          <w:szCs w:val="20"/>
-          <w:lang w:eastAsia="en-GB"/>
-          <w14:ligatures w14:val="none"/>
-        </w:rPr>
-        <w:t>p</w:t>
-      </w:r>
       <w:proofErr w:type="spellStart"/>
       <w:r>
         <w:rPr>
@@ -309,8 +316,9 @@
           <w:lang w:eastAsia="en-GB"/>
           <w14:ligatures w14:val="none"/>
         </w:rPr>
-        <w:t>redict_price</w:t>
-      </w:r>
+        <w:t>predict_price</w:t>
+      </w:r>
+      <w:proofErr w:type="spellEnd"/>
       <w:r>
         <w:rPr>
           <w:rFonts w:ascii="Times New Roman" w:eastAsia="Times New Roman" w:hAnsi="Times New Roman" w:cs="Times New Roman"/>
@@ -321,7 +329,6 @@
         </w:rPr>
         <w:t>.</w:t>
       </w:r>
-      <w:proofErr w:type="spellEnd"/>
     </w:p>
     <w:p>
       <w:pPr>
@@ -442,18 +449,6 @@
         </w:rPr>
         <w:t> → the fitted </w:t>
       </w:r>
-      <w:r>
-        <w:rPr>
-          <w:rFonts w:ascii="Courier New" w:eastAsia="Times New Roman" w:hAnsi="Courier New" w:cs="Courier New"/>
-          <w:color w:val="000000"/>
-          <w:kern w:val="0"/>
-          <w:sz w:val="20"/>
-          <w:szCs w:val="20"/>
-          <w:lang w:eastAsia="en-GB"/>
-          <w14:ligatures w14:val="none"/>
-        </w:rPr>
-        <w:t>S</w:t>
-      </w:r>
       <w:proofErr w:type="spellStart"/>
       <w:r>
         <w:rPr>
@@ -465,17 +460,7 @@
           <w:lang w:eastAsia="en-GB"/>
           <w14:ligatures w14:val="none"/>
         </w:rPr>
-        <w:t>tandardScaler</w:t>
-      </w:r>
-      <w:r>
-        <w:rPr>
-          <w:rFonts w:ascii="Times New Roman" w:eastAsia="Times New Roman" w:hAnsi="Times New Roman" w:cs="Times New Roman"/>
-          <w:color w:val="000000"/>
-          <w:kern w:val="0"/>
-          <w:lang w:eastAsia="en-GB"/>
-          <w14:ligatures w14:val="none"/>
-        </w:rPr>
-        <w:t> </w:t>
+        <w:t>StandardScaler</w:t>
       </w:r>
       <w:proofErr w:type="spellEnd"/>
       <w:r>
@@ -486,7 +471,7 @@
           <w:lang w:eastAsia="en-GB"/>
           <w14:ligatures w14:val="none"/>
         </w:rPr>
-        <w:t>used to scale numeric features during training.</w:t>
+        <w:t> used to scale numeric features during training.</w:t>
       </w:r>
     </w:p>
     <w:p>
@@ -1978,6 +1963,7 @@
           <w:lang w:eastAsia="en-GB"/>
           <w14:ligatures w14:val="none"/>
         </w:rPr>
+        <w:lastRenderedPageBreak/>
         <w:t xml:space="preserve">    for col in </w:t>
       </w:r>
       <w:proofErr w:type="spellStart"/>
@@ -2287,7 +2273,6 @@
           <w:lang w:eastAsia="en-GB"/>
           <w14:ligatures w14:val="none"/>
         </w:rPr>
-        <w:lastRenderedPageBreak/>
         <w:t>Any missing columns are added with </w:t>
       </w:r>
       <w:r>
@@ -5332,6 +5317,29 @@
       <w:szCs w:val="32"/>
     </w:rPr>
   </w:style>
+  <w:style w:type="character" w:styleId="Hyperlink">
+    <w:name w:val="Hyperlink"/>
+    <w:basedOn w:val="DefaultParagraphFont"/>
+    <w:uiPriority w:val="99"/>
+    <w:unhideWhenUsed/>
+    <w:rsid w:val="00287949"/>
+    <w:rPr>
+      <w:color w:val="0563C1" w:themeColor="hyperlink"/>
+      <w:u w:val="single"/>
+    </w:rPr>
+  </w:style>
+  <w:style w:type="character" w:styleId="UnresolvedMention">
+    <w:name w:val="Unresolved Mention"/>
+    <w:basedOn w:val="DefaultParagraphFont"/>
+    <w:uiPriority w:val="99"/>
+    <w:semiHidden/>
+    <w:unhideWhenUsed/>
+    <w:rsid w:val="00287949"/>
+    <w:rPr>
+      <w:color w:val="605E5C"/>
+      <w:shd w:val="clear" w:color="auto" w:fill="E1DFDD"/>
+    </w:rPr>
+  </w:style>
 </w:styles>
 </file>
 

</xml_diff>